<commit_message>
Rootworks backup: 2026-07-28 15:15:56
</commit_message>
<xml_diff>
--- a/Clients/Piper AI/Shared/Email Sequences/15.7.26 US GC-CMAR - Precon & Estimating.docx
+++ b/Clients/Piper AI/Shared/Email Sequences/15.7.26 US GC-CMAR - Precon & Estimating.docx
@@ -113,7 +113,7 @@
       </w:pPr>
       <w:commentRangeStart w:id="100"/>
       <w:r>
-        <w:t xml:space="preserve">An estimating lead took bid leveling from a full day to minutes, with every scope gap between the sub bids flagged.</w:t>
+        <w:t xml:space="preserve">An estimating lead got through a full package in minutes instead of a day, with nothing slipping past the deadline.</w:t>
       </w:r>
       <w:commentRangeEnd w:id="100"/>
       <w:r>
@@ -182,13 +182,13 @@
         <w:t xml:space="preserve"> </w:t>
       </w:r>
       <w:r>
-        <w:t xml:space="preserve">headcount, with a pre-construction operating system that proactively</w:t>
-      </w:r>
-      <w:r>
-        <w:t xml:space="preserve"> </w:t>
-      </w:r>
-      <w:r>
-        <w:t xml:space="preserve">drives your entire process using an evolving brain that unifies your</w:t>
+        <w:t xml:space="preserve">headcount, with a precon operating system that proactively</w:t>
+      </w:r>
+      <w:r>
+        <w:t xml:space="preserve"> </w:t>
+      </w:r>
+      <w:r>
+        <w:t xml:space="preserve">drives your entire process using an evolving AI brain that unifies your</w:t>
       </w:r>
       <w:r>
         <w:t xml:space="preserve"> </w:t>
@@ -202,7 +202,7 @@
         <w:pStyle w:val="BodyText"/>
       </w:pPr>
       <w:r>
-        <w:t xml:space="preserve">An estimating lead took bid leveling from a full day to minutes, with every scope gap between the sub bids flagged.</w:t>
+        <w:t xml:space="preserve">An estimating lead got through a full package in minutes instead of a day, with nothing slipping past the deadline.</w:t>
       </w:r>
     </w:p>
     <w:p>
@@ -279,7 +279,19 @@
       </w:pPr>
       <w:commentRangeStart w:id="101"/>
       <w:r>
-        <w:t xml:space="preserve">A VP of business development took go/no-go on 14 pursuits from a full day to under 30 minutes, every risk cited to the exact page.</w:t>
+        <w:t xml:space="preserve">A VP of</w:t>
+      </w:r>
+      <w:r>
+        <w:t xml:space="preserve"> </w:t>
+      </w:r>
+      <w:r>
+        <w:t xml:space="preserve">business development took go/no-go on 14 pursuits from a full day to</w:t>
+      </w:r>
+      <w:r>
+        <w:t xml:space="preserve"> </w:t>
+      </w:r>
+      <w:r>
+        <w:t xml:space="preserve">under 30 minutes, every risk cited to the exact page.</w:t>
       </w:r>
     </w:p>
     <w:p>
@@ -362,7 +374,13 @@
         <w:pStyle w:val="BodyText"/>
       </w:pPr>
       <w:r>
-        <w:t xml:space="preserve">A VP of business development took go/no-go on 14 pursuits from a full day to under 30 minutes, every risk cited to the exact page.</w:t>
+        <w:t xml:space="preserve">A VP of business development took go/no-go on 14 pursuits from a full</w:t>
+      </w:r>
+      <w:r>
+        <w:t xml:space="preserve"> </w:t>
+      </w:r>
+      <w:r>
+        <w:t xml:space="preserve">day to under 30 minutes, every risk cited to the exact page.</w:t>
       </w:r>
     </w:p>
     <w:p>
@@ -443,13 +461,19 @@
       </w:pPr>
       <w:commentRangeStart w:id="102"/>
       <w:r>
-        <w:t xml:space="preserve">The proposals that win are not the fastest. They are the ones that show</w:t>
-      </w:r>
-      <w:r>
-        <w:t xml:space="preserve"> </w:t>
-      </w:r>
-      <w:r>
-        <w:t xml:space="preserve">the owner you understand and relate to the job better than anyone else</w:t>
+        <w:t xml:space="preserve">The</w:t>
+      </w:r>
+      <w:r>
+        <w:t xml:space="preserve"> </w:t>
+      </w:r>
+      <w:r>
+        <w:t xml:space="preserve">proposals that win are not the fastest. They are the ones that show the</w:t>
+      </w:r>
+      <w:r>
+        <w:t xml:space="preserve"> </w:t>
+      </w:r>
+      <w:r>
+        <w:t xml:space="preserve">owner you understand and relate to the job better than anyone else</w:t>
       </w:r>
       <w:r>
         <w:t xml:space="preserve"> </w:t>
@@ -505,7 +529,40 @@
         <w:annotationRef/>
       </w:r>
       <w:r>
-        <w:t xml:space="preserve">APPLIED: K-12 stripped (Nikol’s relevance point from the Business Leaders doc, applied here too) and the proof now carries the specificity this email promises - the flagged gaps. Same in 1B.</w:t>
+        <w:t xml:space="preserve">APPLIED: K-12 stripped (Nikol’s relevance point from the Business</w:t>
+      </w:r>
+      <w:r>
+        <w:t xml:space="preserve"> </w:t>
+      </w:r>
+      <w:r>
+        <w:t xml:space="preserve">Leaders doc, applied here too) and the proof now carries the specificity</w:t>
+      </w:r>
+      <w:r>
+        <w:t xml:space="preserve"> </w:t>
+      </w:r>
+      <w:r>
+        <w:t xml:space="preserve">this email promises. UPDATED per Nikol’s call point (23.7): the long sentence and the proof were two different features -</w:t>
+      </w:r>
+      <w:r>
+        <w:t xml:space="preserve"> </w:t>
+      </w:r>
+      <w:r>
+        <w:t xml:space="preserve">“pasta sauce vs ice cream”</w:t>
+      </w:r>
+      <w:r>
+        <w:t xml:space="preserve">. The proof now matches the paragraph - getting through the package and nothing slipping under the deadline.</w:t>
+      </w:r>
+      <w:r>
+        <w:t xml:space="preserve"> </w:t>
+      </w:r>
+      <w:r>
+        <w:t xml:space="preserve">“Bid leveling”</w:t>
+      </w:r>
+      <w:r>
+        <w:t xml:space="preserve"> </w:t>
+      </w:r>
+      <w:r>
+        <w:t xml:space="preserve">removed. Same in 1B.</w:t>
       </w:r>
     </w:p>
   </w:comment>
@@ -527,10 +584,22 @@
         <w:t xml:space="preserve"> </w:t>
       </w:r>
       <w:r>
-        <w:t xml:space="preserve">“nothing slips”</w:t>
-      </w:r>
-      <w:r>
-        <w:t xml:space="preserve">, and the CTA is a concrete ask we deliver in a reply. Same in 1D.</w:t>
+        <w:t xml:space="preserve">“nothing</w:t>
+      </w:r>
+      <w:r>
+        <w:t xml:space="preserve"> </w:t>
+      </w:r>
+      <w:r>
+        <w:t xml:space="preserve">slips”</w:t>
+      </w:r>
+      <w:r>
+        <w:t xml:space="preserve">, and the CTA is a concrete ask we deliver in a reply. Same in</w:t>
+      </w:r>
+      <w:r>
+        <w:t xml:space="preserve"> </w:t>
+      </w:r>
+      <w:r>
+        <w:t xml:space="preserve">1D.</w:t>
       </w:r>
     </w:p>
   </w:comment>
@@ -558,7 +627,13 @@
         <w:t xml:space="preserve"> </w:t>
       </w:r>
       <w:r>
-        <w:t xml:space="preserve">“Would you like me to”</w:t>
+        <w:t xml:space="preserve">“Would you</w:t>
+      </w:r>
+      <w:r>
+        <w:t xml:space="preserve"> </w:t>
+      </w:r>
+      <w:r>
+        <w:t xml:space="preserve">like me to”</w:t>
       </w:r>
       <w:r>
         <w:t xml:space="preserve">) is live as written; one grammar fix applied -</w:t>
@@ -567,7 +642,13 @@
         <w:t xml:space="preserve"> </w:t>
       </w:r>
       <w:r>
-        <w:t xml:space="preserve">“without adding a headcount”</w:t>
+        <w:t xml:space="preserve">“without</w:t>
+      </w:r>
+      <w:r>
+        <w:t xml:space="preserve"> </w:t>
+      </w:r>
+      <w:r>
+        <w:t xml:space="preserve">adding a headcount”</w:t>
       </w:r>
       <w:r>
         <w:t xml:space="preserve"> </w:t>
@@ -582,7 +663,19 @@
         <w:t xml:space="preserve">“without adding headcount”</w:t>
       </w:r>
       <w:r>
-        <w:t xml:space="preserve">. Your other edits (precon operating system, evolving AI brain, general AI tool) are all live.</w:t>
+        <w:t xml:space="preserve">. Your other edits</w:t>
+      </w:r>
+      <w:r>
+        <w:t xml:space="preserve"> </w:t>
+      </w:r>
+      <w:r>
+        <w:t xml:space="preserve">(precon operating system, evolving AI brain, general AI tool) are all</w:t>
+      </w:r>
+      <w:r>
+        <w:t xml:space="preserve"> </w:t>
+      </w:r>
+      <w:r>
+        <w:t xml:space="preserve">live.</w:t>
       </w:r>
     </w:p>
   </w:comment>

</xml_diff>